<commit_message>
Apply post-Stauffer-feedback updates to geothermal paper
Adds the approved clarification on excluded avoided-drilling-cost savings, cites the current (2025) edition of HRS § 182-7(c), and removes the duplicate in-image title from Figure 1, regenerating it accordingly. Updates the source log, spec research log, Word source, and final submission PDF to match.

Co-Authored-By: Claude Sonnet 5 <noreply@anthropic.com>
Claude-Session: https://claude.ai/code/session_01Qu37dBXrNjEFgAiFdronZc
</commit_message>
<xml_diff>
--- a/analysis/research-paper-for-word.docx
+++ b/analysis/research-paper-for-word.docx
@@ -164,7 +164,7 @@
           <w:i w:val="0"/>
           <w:sz w:val="24"/>
         </w:rPr>
-        <w:t>This money is not building a power plant; it is buying information about the resource. That information has economic value because geothermal development requires substantial exploration spending while major questions remain unresolved. Better information can improve development decisions, including whether to walk away.</w:t>
+        <w:t>This money is not building a power plant; it is buying information about the resource. That information has economic value because geothermal development requires substantial exploration spending while major questions remain unresolved. Better information can improve development decisions, including whether to walk away. I also recognize that characterization can create value by helping developers avoid spending money on unsuccessful drilling. However, I chose not to include those savings in my model because they would primarily benefit the private developer, while my analysis focuses specifically on public economic value.</w:t>
       </w:r>
     </w:p>
     <w:p>
@@ -345,7 +345,7 @@
           <w:i w:val="0"/>
           <w:sz w:val="24"/>
         </w:rPr>
-        <w:t>Distribution matters because economic value and who captures it are different questions. State law allocates a county share of geothermal royalties (Haw. Rev. Stat. § 182-7(c)). On Hawaiian home lands, the state Attorney General determined that geothermal royalties go to the Department of Hawaiian Home Lands under the Hawaiian Homes Commission Act (Department of Hawaiian Home Lands [DHHL], 2014). Hawaiʻi County has also directed geothermal royalty revenue toward relocation and community benefits in Lower Puna (County of Hawaiʻi, 2024). These examples do not determine how a hypothetical Maui project’s benefits would be divided; land tenure and project structure would matter.</w:t>
+        <w:t>Distribution matters because economic value and who captures it are different questions. State law allocates a county share of geothermal royalties (Haw. Rev. Stat. § 182-7(c), 2025). On Hawaiian home lands, the state Attorney General determined that geothermal royalties go to the Department of Hawaiian Home Lands under the Hawaiian Homes Commission Act (Department of Hawaiian Home Lands [DHHL], 2014). Hawaiʻi County has also directed geothermal royalty revenue toward relocation and community benefits in Lower Puna (County of Hawaiʻi, 2024). These examples do not determine how a hypothetical Maui project’s benefits would be divided; land tenure and project structure would matter.</w:t>
       </w:r>
     </w:p>
     <w:p>
@@ -509,7 +509,7 @@
       <w:r>
         <w:drawing>
           <wp:inline xmlns:a="http://schemas.openxmlformats.org/drawingml/2006/main" xmlns:pic="http://schemas.openxmlformats.org/drawingml/2006/picture">
-            <wp:extent cx="5486400" cy="4142650"/>
+            <wp:extent cx="5486400" cy="4100875"/>
             <wp:docPr id="1" name="Picture 1"/>
             <wp:cNvGraphicFramePr>
               <a:graphicFrameLocks noChangeAspect="1"/>
@@ -530,7 +530,7 @@
                   <pic:spPr>
                     <a:xfrm>
                       <a:off x="0" y="0"/>
-                      <a:ext cx="5486400" cy="4142650"/>
+                      <a:ext cx="5486400" cy="4100875"/>
                     </a:xfrm>
                     <a:prstGeom prst="rect"/>
                   </pic:spPr>
@@ -646,7 +646,7 @@
           <w:sz w:val="24"/>
           <w:rFonts w:ascii="Times New Roman" w:hAnsi="Times New Roman" w:eastAsia="Times New Roman" w:cs="Times New Roman"/>
         </w:rPr>
-        <w:t>Haw. Rev. Stat. § 182-7(c). https://www.capitol.hawaii.gov/hrscurrent/vol03_ch0121-0200d/HRS0182/HRS_0182-0007.htm</w:t>
+        <w:t>Haw. Rev. Stat. § 182-7(c) (2025). https://www.capitol.hawaii.gov/hrscurrent/vol03_ch0121-0200d/HRS0182/HRS_0182-0007.htm</w:t>
       </w:r>
     </w:p>
     <w:p>

</xml_diff>